<commit_message>
Week 7 report: write "Precision at k" instead of P@k in the measures table
Co-Authored-By: Claude Opus 5.5 <noreply@anthropic.com>
</commit_message>
<xml_diff>
--- a/report/Week7-Evaluation-Report.docx
+++ b/report/Week7-Evaluation-Report.docx
@@ -272,7 +272,7 @@
                 <w:b w:val="false"/>
                 <w:bCs w:val="false"/>
               </w:rPr>
-              <w:t xml:space="preserve">P@k, R@k, F1@10</w:t>
+              <w:t xml:space="preserve">Precision at k, Recall at k, F1 at 10</w:t>
             </w:r>
           </w:p>
         </w:tc>
@@ -1338,7 +1338,7 @@
       <w:r>
         <w:t xml:space="preserve">The code is available at </w:t>
       </w:r>
-      <w:hyperlink w:history="1" r:id="rIdx2h_lnjxt_m6ctrtqek2q">
+      <w:hyperlink w:history="1" r:id="rIdiojkowohlfiqdhqons3lu">
         <w:r>
           <w:rPr>
             <w:rStyle w:val="Hyperlink"/>

</xml_diff>